<commit_message>
updated backend, includes AR formatting, acc system, save states(WIP), routes
</commit_message>
<xml_diff>
--- a/backend/template_files/AR_template.docx
+++ b/backend/template_files/AR_template.docx
@@ -125,50 +125,6 @@
                 <w:szCs w:val="27"/>
               </w:rPr>
               <w:t xml:space="preserve">  ACCOMPLISHMENT REPORT</w:t>
-            </w:r>
-          </w:p>
-          <w:p>
-            <w:pPr>
-              <w:pBdr>
-                <w:top w:val="nil"/>
-                <w:left w:val="nil"/>
-                <w:bottom w:val="nil"/>
-                <w:right w:val="nil"/>
-                <w:between w:val="nil"/>
-              </w:pBdr>
-              <w:spacing w:before="14" w:line="291" w:lineRule="auto"/>
-              <w:ind w:left="112" w:right="3152"/>
-              <w:jc w:val="center"/>
-              <w:rPr>
-                <w:rFonts w:ascii="Arial" w:eastAsia="Arial" w:hAnsi="Arial" w:cs="Arial"/>
-                <w:b/>
-                <w:bCs/>
-                <w:color w:val="000000"/>
-                <w:sz w:val="27"/>
-                <w:szCs w:val="27"/>
-              </w:rPr>
-            </w:pPr>
-            <w:r>
-              <w:rPr>
-                <w:rFonts w:ascii="Arial" w:eastAsia="Arial" w:hAnsi="Arial" w:cs="Arial"/>
-                <w:b/>
-                <w:bCs/>
-                <w:color w:val="000000"/>
-                <w:sz w:val="27"/>
-                <w:szCs w:val="27"/>
-              </w:rPr>
-              <w:t xml:space="preserve">                                     </w:t>
-            </w:r>
-            <w:r>
-              <w:rPr>
-                <w:rFonts w:ascii="Arial" w:eastAsia="Arial" w:hAnsi="Arial" w:cs="Arial"/>
-                <w:b/>
-                <w:bCs/>
-                <w:color w:val="000000"/>
-                <w:sz w:val="24"/>
-                <w:szCs w:val="24"/>
-              </w:rPr>
-              <w:t xml:space="preserve">For the Period </w:t>
             </w:r>
           </w:p>
         </w:tc>

</xml_diff>